<commit_message>
feat: Complainify brand in sidebar/navbar now links to role-based dashboard instead of landing page
</commit_message>
<xml_diff>
--- a/Project-VI.-orgdocx.docx
+++ b/Project-VI.-orgdocx.docx
@@ -54,19 +54,8 @@
           <w:sz w:val="28"/>
           <w:szCs w:val="28"/>
         </w:rPr>
-        <w:t xml:space="preserve">Student </w:t>
-      </w:r>
-      <w:proofErr w:type="spellStart"/>
-      <w:r>
-        <w:rPr>
-          <w:b/>
-          <w:bCs/>
-          <w:sz w:val="28"/>
-          <w:szCs w:val="28"/>
-        </w:rPr>
         <w:t>Complainify</w:t>
       </w:r>
-      <w:proofErr w:type="spellEnd"/>
     </w:p>
     <w:p>
       <w:pPr>
@@ -306,21 +295,12 @@
           <w:szCs w:val="28"/>
         </w:rPr>
       </w:pPr>
-      <w:proofErr w:type="spellStart"/>
       <w:r>
         <w:rPr>
           <w:sz w:val="28"/>
           <w:szCs w:val="28"/>
         </w:rPr>
-        <w:t>Purbanchal</w:t>
-      </w:r>
-      <w:proofErr w:type="spellEnd"/>
-      <w:r>
-        <w:rPr>
-          <w:sz w:val="28"/>
-          <w:szCs w:val="28"/>
-        </w:rPr>
-        <w:t xml:space="preserve"> University</w:t>
+        <w:t>Purbanchal University</w:t>
       </w:r>
     </w:p>
     <w:p>
@@ -442,21 +422,12 @@
           <w:szCs w:val="28"/>
         </w:rPr>
       </w:pPr>
-      <w:proofErr w:type="spellStart"/>
       <w:r>
         <w:rPr>
           <w:sz w:val="28"/>
           <w:szCs w:val="28"/>
         </w:rPr>
-        <w:t>Putalisadak</w:t>
-      </w:r>
-      <w:proofErr w:type="spellEnd"/>
-      <w:r>
-        <w:rPr>
-          <w:sz w:val="28"/>
-          <w:szCs w:val="28"/>
-        </w:rPr>
-        <w:t>, Kathmandu</w:t>
+        <w:t>Putalisadak, Kathmandu</w:t>
       </w:r>
     </w:p>
     <w:p>
@@ -546,159 +517,157 @@
           <w:sz w:val="28"/>
           <w:szCs w:val="28"/>
         </w:rPr>
-        <w:t xml:space="preserve">Student </w:t>
-      </w:r>
-      <w:proofErr w:type="spellStart"/>
-      <w:r>
+        <w:t>Complainify</w:t>
+      </w:r>
+    </w:p>
+    <w:p>
+      <w:pPr>
+        <w:spacing w:line="480" w:lineRule="auto"/>
+        <w:jc w:val="center"/>
+        <w:rPr>
+          <w:sz w:val="28"/>
+          <w:szCs w:val="28"/>
+        </w:rPr>
+      </w:pPr>
+      <w:r>
+        <w:rPr>
+          <w:sz w:val="28"/>
+          <w:szCs w:val="28"/>
+        </w:rPr>
+        <w:t xml:space="preserve">Submitted in partial fulfillment of the requirement of </w:t>
+      </w:r>
+    </w:p>
+    <w:p>
+      <w:pPr>
+        <w:spacing w:line="480" w:lineRule="auto"/>
+        <w:jc w:val="center"/>
+        <w:rPr>
+          <w:sz w:val="28"/>
+          <w:szCs w:val="28"/>
+        </w:rPr>
+      </w:pPr>
+      <w:r>
+        <w:rPr>
+          <w:sz w:val="28"/>
+          <w:szCs w:val="28"/>
+        </w:rPr>
+        <w:t>P</w:t>
+      </w:r>
+      <w:r>
+        <w:rPr>
+          <w:sz w:val="28"/>
+          <w:szCs w:val="28"/>
+        </w:rPr>
+        <w:t>roject</w:t>
+      </w:r>
+      <w:r>
+        <w:rPr>
+          <w:sz w:val="28"/>
+          <w:szCs w:val="28"/>
+        </w:rPr>
+        <w:t>-V</w:t>
+      </w:r>
+      <w:r>
+        <w:rPr>
+          <w:sz w:val="28"/>
+          <w:szCs w:val="28"/>
+        </w:rPr>
+        <w:t>I</w:t>
+      </w:r>
+      <w:r>
+        <w:rPr>
+          <w:sz w:val="28"/>
+          <w:szCs w:val="28"/>
+        </w:rPr>
+        <w:t xml:space="preserve"> </w:t>
+      </w:r>
+      <w:r>
+        <w:rPr>
+          <w:sz w:val="28"/>
+          <w:szCs w:val="28"/>
+        </w:rPr>
+        <w:t>(</w:t>
+      </w:r>
+      <w:r>
+        <w:rPr>
+          <w:sz w:val="28"/>
+          <w:szCs w:val="28"/>
+        </w:rPr>
+        <w:t>BIT3</w:t>
+      </w:r>
+      <w:r>
+        <w:rPr>
+          <w:sz w:val="28"/>
+          <w:szCs w:val="28"/>
+        </w:rPr>
+        <w:t>5</w:t>
+      </w:r>
+      <w:r>
+        <w:rPr>
+          <w:sz w:val="28"/>
+          <w:szCs w:val="28"/>
+        </w:rPr>
+        <w:t>6CO)</w:t>
+      </w:r>
+    </w:p>
+    <w:p>
+      <w:pPr>
+        <w:spacing w:line="480" w:lineRule="auto"/>
+        <w:jc w:val="center"/>
+        <w:rPr>
+          <w:sz w:val="28"/>
+          <w:szCs w:val="28"/>
+        </w:rPr>
+      </w:pPr>
+      <w:r>
+        <w:rPr>
+          <w:sz w:val="28"/>
+          <w:szCs w:val="28"/>
+        </w:rPr>
+        <w:t>B</w:t>
+      </w:r>
+      <w:r>
+        <w:rPr>
+          <w:sz w:val="28"/>
+          <w:szCs w:val="28"/>
+        </w:rPr>
+        <w:t xml:space="preserve">achelor </w:t>
+      </w:r>
+      <w:r>
+        <w:rPr>
+          <w:sz w:val="28"/>
+          <w:szCs w:val="28"/>
+        </w:rPr>
+        <w:t>in</w:t>
+      </w:r>
+      <w:r>
+        <w:rPr>
+          <w:sz w:val="28"/>
+          <w:szCs w:val="28"/>
+        </w:rPr>
+        <w:t xml:space="preserve"> Information Technology</w:t>
+      </w:r>
+    </w:p>
+    <w:p>
+      <w:pPr>
+        <w:spacing w:line="480" w:lineRule="auto"/>
+        <w:jc w:val="center"/>
         <w:rPr>
           <w:b/>
           <w:bCs/>
           <w:sz w:val="28"/>
           <w:szCs w:val="28"/>
         </w:rPr>
-        <w:t>Complainify</w:t>
-      </w:r>
-      <w:proofErr w:type="spellEnd"/>
-    </w:p>
-    <w:p>
-      <w:pPr>
-        <w:spacing w:line="480" w:lineRule="auto"/>
-        <w:jc w:val="center"/>
-        <w:rPr>
-          <w:sz w:val="28"/>
-          <w:szCs w:val="28"/>
-        </w:rPr>
-      </w:pPr>
-      <w:r>
-        <w:rPr>
-          <w:sz w:val="28"/>
-          <w:szCs w:val="28"/>
-        </w:rPr>
-        <w:t xml:space="preserve">Submitted in partial fulfillment of the requirement of </w:t>
-      </w:r>
-    </w:p>
-    <w:p>
-      <w:pPr>
-        <w:spacing w:line="480" w:lineRule="auto"/>
-        <w:jc w:val="center"/>
-        <w:rPr>
-          <w:sz w:val="28"/>
-          <w:szCs w:val="28"/>
-        </w:rPr>
-      </w:pPr>
-      <w:r>
-        <w:rPr>
-          <w:sz w:val="28"/>
-          <w:szCs w:val="28"/>
-        </w:rPr>
-        <w:t>P</w:t>
-      </w:r>
-      <w:r>
-        <w:rPr>
-          <w:sz w:val="28"/>
-          <w:szCs w:val="28"/>
-        </w:rPr>
-        <w:t>roject</w:t>
-      </w:r>
-      <w:r>
-        <w:rPr>
-          <w:sz w:val="28"/>
-          <w:szCs w:val="28"/>
-        </w:rPr>
-        <w:t>-V</w:t>
-      </w:r>
-      <w:r>
-        <w:rPr>
-          <w:sz w:val="28"/>
-          <w:szCs w:val="28"/>
-        </w:rPr>
-        <w:t>I</w:t>
-      </w:r>
-      <w:r>
-        <w:rPr>
-          <w:sz w:val="28"/>
-          <w:szCs w:val="28"/>
-        </w:rPr>
-        <w:t xml:space="preserve"> </w:t>
-      </w:r>
-      <w:r>
-        <w:rPr>
-          <w:sz w:val="28"/>
-          <w:szCs w:val="28"/>
-        </w:rPr>
-        <w:t>(</w:t>
-      </w:r>
-      <w:r>
-        <w:rPr>
-          <w:sz w:val="28"/>
-          <w:szCs w:val="28"/>
-        </w:rPr>
-        <w:t>BIT3</w:t>
-      </w:r>
-      <w:r>
-        <w:rPr>
-          <w:sz w:val="28"/>
-          <w:szCs w:val="28"/>
-        </w:rPr>
-        <w:t>5</w:t>
-      </w:r>
-      <w:r>
-        <w:rPr>
-          <w:sz w:val="28"/>
-          <w:szCs w:val="28"/>
-        </w:rPr>
-        <w:t>6CO)</w:t>
-      </w:r>
-    </w:p>
-    <w:p>
-      <w:pPr>
-        <w:spacing w:line="480" w:lineRule="auto"/>
-        <w:jc w:val="center"/>
-        <w:rPr>
-          <w:sz w:val="28"/>
-          <w:szCs w:val="28"/>
-        </w:rPr>
-      </w:pPr>
-      <w:r>
-        <w:rPr>
-          <w:sz w:val="28"/>
-          <w:szCs w:val="28"/>
-        </w:rPr>
-        <w:t>B</w:t>
-      </w:r>
-      <w:r>
-        <w:rPr>
-          <w:sz w:val="28"/>
-          <w:szCs w:val="28"/>
-        </w:rPr>
-        <w:t xml:space="preserve">achelor </w:t>
-      </w:r>
-      <w:r>
-        <w:rPr>
-          <w:sz w:val="28"/>
-          <w:szCs w:val="28"/>
-        </w:rPr>
-        <w:t>in</w:t>
-      </w:r>
-      <w:r>
-        <w:rPr>
-          <w:sz w:val="28"/>
-          <w:szCs w:val="28"/>
-        </w:rPr>
-        <w:t xml:space="preserve"> Information Technology</w:t>
-      </w:r>
-    </w:p>
-    <w:p>
-      <w:pPr>
-        <w:spacing w:line="480" w:lineRule="auto"/>
-        <w:jc w:val="center"/>
+      </w:pPr>
+      <w:r>
         <w:rPr>
           <w:b/>
           <w:bCs/>
           <w:sz w:val="28"/>
           <w:szCs w:val="28"/>
         </w:rPr>
-      </w:pPr>
+        <w:t xml:space="preserve">Submitted </w:t>
+      </w:r>
       <w:r>
         <w:rPr>
           <w:b/>
@@ -706,7 +675,7 @@
           <w:sz w:val="28"/>
           <w:szCs w:val="28"/>
         </w:rPr>
-        <w:t xml:space="preserve">Submitted </w:t>
+        <w:t>T</w:t>
       </w:r>
       <w:r>
         <w:rPr>
@@ -715,232 +684,205 @@
           <w:sz w:val="28"/>
           <w:szCs w:val="28"/>
         </w:rPr>
-        <w:t>T</w:t>
-      </w:r>
-      <w:r>
+        <w:t>o</w:t>
+      </w:r>
+    </w:p>
+    <w:p>
+      <w:pPr>
+        <w:spacing w:line="480" w:lineRule="auto"/>
+        <w:jc w:val="center"/>
+        <w:rPr>
+          <w:sz w:val="28"/>
+          <w:szCs w:val="28"/>
+        </w:rPr>
+      </w:pPr>
+      <w:r>
+        <w:rPr>
+          <w:sz w:val="28"/>
+          <w:szCs w:val="28"/>
+        </w:rPr>
+        <w:t>Purbanchal University</w:t>
+      </w:r>
+    </w:p>
+    <w:p>
+      <w:pPr>
+        <w:spacing w:line="480" w:lineRule="auto"/>
+        <w:jc w:val="center"/>
+        <w:rPr>
+          <w:sz w:val="28"/>
+          <w:szCs w:val="28"/>
+        </w:rPr>
+      </w:pPr>
+      <w:r>
+        <w:rPr>
+          <w:sz w:val="28"/>
+          <w:szCs w:val="28"/>
+        </w:rPr>
+        <w:t>Biratnagar, Nepal</w:t>
+      </w:r>
+    </w:p>
+    <w:p>
+      <w:pPr>
+        <w:spacing w:line="480" w:lineRule="auto"/>
+        <w:jc w:val="center"/>
         <w:rPr>
           <w:b/>
           <w:bCs/>
           <w:sz w:val="28"/>
           <w:szCs w:val="28"/>
         </w:rPr>
-        <w:t>o</w:t>
-      </w:r>
-    </w:p>
-    <w:p>
-      <w:pPr>
-        <w:spacing w:line="480" w:lineRule="auto"/>
-        <w:jc w:val="center"/>
-        <w:rPr>
-          <w:sz w:val="28"/>
-          <w:szCs w:val="28"/>
-        </w:rPr>
-      </w:pPr>
-      <w:proofErr w:type="spellStart"/>
-      <w:r>
-        <w:rPr>
-          <w:sz w:val="28"/>
-          <w:szCs w:val="28"/>
-        </w:rPr>
-        <w:t>Purbanchal</w:t>
-      </w:r>
-      <w:proofErr w:type="spellEnd"/>
-      <w:r>
-        <w:rPr>
-          <w:sz w:val="28"/>
-          <w:szCs w:val="28"/>
-        </w:rPr>
-        <w:t xml:space="preserve"> University</w:t>
-      </w:r>
-    </w:p>
-    <w:p>
-      <w:pPr>
-        <w:spacing w:line="480" w:lineRule="auto"/>
-        <w:jc w:val="center"/>
-        <w:rPr>
-          <w:sz w:val="28"/>
-          <w:szCs w:val="28"/>
-        </w:rPr>
-      </w:pPr>
-      <w:r>
-        <w:rPr>
-          <w:sz w:val="28"/>
-          <w:szCs w:val="28"/>
-        </w:rPr>
-        <w:t>Biratnagar, Nepal</w:t>
-      </w:r>
-    </w:p>
-    <w:p>
-      <w:pPr>
-        <w:spacing w:line="480" w:lineRule="auto"/>
-        <w:jc w:val="center"/>
+      </w:pPr>
+      <w:r>
         <w:rPr>
           <w:b/>
           <w:bCs/>
           <w:sz w:val="28"/>
           <w:szCs w:val="28"/>
         </w:rPr>
-      </w:pPr>
-      <w:r>
+        <w:t>Submitted By</w:t>
+      </w:r>
+    </w:p>
+    <w:p>
+      <w:pPr>
+        <w:spacing w:line="480" w:lineRule="auto"/>
+        <w:jc w:val="center"/>
+        <w:rPr>
+          <w:sz w:val="28"/>
+          <w:szCs w:val="28"/>
+        </w:rPr>
+      </w:pPr>
+      <w:r>
+        <w:rPr>
+          <w:sz w:val="28"/>
+          <w:szCs w:val="28"/>
+        </w:rPr>
+        <w:t>Mridul Prakash Shah (350560)</w:t>
+      </w:r>
+    </w:p>
+    <w:p>
+      <w:pPr>
+        <w:spacing w:line="480" w:lineRule="auto"/>
+        <w:jc w:val="center"/>
+        <w:rPr>
+          <w:sz w:val="28"/>
+          <w:szCs w:val="28"/>
+        </w:rPr>
+      </w:pPr>
+      <w:r>
+        <w:rPr>
+          <w:sz w:val="28"/>
+          <w:szCs w:val="28"/>
+        </w:rPr>
+        <w:t>Om Prakash Basnet (350562)</w:t>
+      </w:r>
+    </w:p>
+    <w:p>
+      <w:pPr>
+        <w:spacing w:line="480" w:lineRule="auto"/>
+        <w:jc w:val="center"/>
+        <w:rPr>
+          <w:sz w:val="28"/>
+          <w:szCs w:val="28"/>
+        </w:rPr>
+      </w:pPr>
+      <w:r>
+        <w:rPr>
+          <w:sz w:val="28"/>
+          <w:szCs w:val="28"/>
+        </w:rPr>
+        <w:t>Samir Poudel (350574)</w:t>
+      </w:r>
+    </w:p>
+    <w:p>
+      <w:pPr>
+        <w:spacing w:line="480" w:lineRule="auto"/>
+        <w:jc w:val="center"/>
         <w:rPr>
           <w:b/>
           <w:bCs/>
           <w:sz w:val="28"/>
           <w:szCs w:val="28"/>
         </w:rPr>
-        <w:t>Submitted By</w:t>
-      </w:r>
-    </w:p>
-    <w:p>
-      <w:pPr>
-        <w:spacing w:line="480" w:lineRule="auto"/>
-        <w:jc w:val="center"/>
-        <w:rPr>
-          <w:sz w:val="28"/>
-          <w:szCs w:val="28"/>
-        </w:rPr>
-      </w:pPr>
-      <w:r>
-        <w:rPr>
-          <w:sz w:val="28"/>
-          <w:szCs w:val="28"/>
-        </w:rPr>
-        <w:t>Mridul Prakash Shah (350560)</w:t>
-      </w:r>
-    </w:p>
-    <w:p>
-      <w:pPr>
-        <w:spacing w:line="480" w:lineRule="auto"/>
-        <w:jc w:val="center"/>
-        <w:rPr>
-          <w:sz w:val="28"/>
-          <w:szCs w:val="28"/>
-        </w:rPr>
-      </w:pPr>
-      <w:r>
-        <w:rPr>
-          <w:sz w:val="28"/>
-          <w:szCs w:val="28"/>
-        </w:rPr>
-        <w:t>Om Prakash Basnet (350562)</w:t>
-      </w:r>
-    </w:p>
-    <w:p>
-      <w:pPr>
-        <w:spacing w:line="480" w:lineRule="auto"/>
-        <w:jc w:val="center"/>
-        <w:rPr>
-          <w:sz w:val="28"/>
-          <w:szCs w:val="28"/>
-        </w:rPr>
-      </w:pPr>
-      <w:r>
-        <w:rPr>
-          <w:sz w:val="28"/>
-          <w:szCs w:val="28"/>
-        </w:rPr>
-        <w:t>Samir Poudel (350574)</w:t>
-      </w:r>
-    </w:p>
-    <w:p>
-      <w:pPr>
-        <w:spacing w:line="480" w:lineRule="auto"/>
-        <w:jc w:val="center"/>
+      </w:pPr>
+      <w:r>
         <w:rPr>
           <w:b/>
           <w:bCs/>
           <w:sz w:val="28"/>
           <w:szCs w:val="28"/>
         </w:rPr>
-      </w:pPr>
-      <w:r>
+        <w:t>Project Supervisor</w:t>
+      </w:r>
+    </w:p>
+    <w:p>
+      <w:pPr>
+        <w:spacing w:line="480" w:lineRule="auto"/>
+        <w:jc w:val="center"/>
+        <w:rPr>
+          <w:sz w:val="28"/>
+          <w:szCs w:val="28"/>
+        </w:rPr>
+      </w:pPr>
+      <w:r>
+        <w:rPr>
+          <w:sz w:val="28"/>
+          <w:szCs w:val="28"/>
+        </w:rPr>
+        <w:t>Er. Maryada Karki</w:t>
+      </w:r>
+    </w:p>
+    <w:p>
+      <w:pPr>
+        <w:spacing w:line="480" w:lineRule="auto"/>
+        <w:rPr>
+          <w:sz w:val="28"/>
+          <w:szCs w:val="28"/>
+        </w:rPr>
+      </w:pPr>
+      <w:r>
+        <w:rPr>
+          <w:sz w:val="28"/>
+          <w:szCs w:val="28"/>
+        </w:rPr>
+        <w:t xml:space="preserve">                                          Mr. Santosh Shah</w:t>
+      </w:r>
+    </w:p>
+    <w:p>
+      <w:pPr>
+        <w:spacing w:line="480" w:lineRule="auto"/>
+        <w:jc w:val="center"/>
         <w:rPr>
           <w:b/>
           <w:bCs/>
           <w:sz w:val="28"/>
           <w:szCs w:val="28"/>
         </w:rPr>
-        <w:t>Project Supervisor</w:t>
-      </w:r>
-    </w:p>
-    <w:p>
-      <w:pPr>
-        <w:spacing w:line="480" w:lineRule="auto"/>
-        <w:jc w:val="center"/>
-        <w:rPr>
-          <w:sz w:val="28"/>
-          <w:szCs w:val="28"/>
-        </w:rPr>
-      </w:pPr>
-      <w:r>
-        <w:rPr>
-          <w:sz w:val="28"/>
-          <w:szCs w:val="28"/>
-        </w:rPr>
-        <w:t>Er. Maryada Karki</w:t>
-      </w:r>
-    </w:p>
-    <w:p>
-      <w:pPr>
-        <w:spacing w:line="480" w:lineRule="auto"/>
-        <w:rPr>
-          <w:sz w:val="28"/>
-          <w:szCs w:val="28"/>
-        </w:rPr>
-      </w:pPr>
-      <w:r>
-        <w:rPr>
-          <w:sz w:val="28"/>
-          <w:szCs w:val="28"/>
-        </w:rPr>
-        <w:t xml:space="preserve">                                          Mr. Santosh Shah</w:t>
-      </w:r>
-    </w:p>
-    <w:p>
-      <w:pPr>
-        <w:spacing w:line="480" w:lineRule="auto"/>
-        <w:jc w:val="center"/>
+      </w:pPr>
+      <w:r>
         <w:rPr>
           <w:b/>
           <w:bCs/>
           <w:sz w:val="28"/>
           <w:szCs w:val="28"/>
         </w:rPr>
-      </w:pPr>
-      <w:r>
-        <w:rPr>
-          <w:b/>
-          <w:bCs/>
+        <w:t>KANTIPUR CITY COLLEGE</w:t>
+      </w:r>
+    </w:p>
+    <w:p>
+      <w:pPr>
+        <w:spacing w:line="480" w:lineRule="auto"/>
+        <w:jc w:val="center"/>
+        <w:rPr>
           <w:sz w:val="28"/>
           <w:szCs w:val="28"/>
         </w:rPr>
-        <w:t>KANTIPUR CITY COLLEGE</w:t>
-      </w:r>
-    </w:p>
-    <w:p>
-      <w:pPr>
-        <w:spacing w:line="480" w:lineRule="auto"/>
-        <w:jc w:val="center"/>
+      </w:pPr>
+      <w:r>
         <w:rPr>
           <w:sz w:val="28"/>
           <w:szCs w:val="28"/>
         </w:rPr>
-      </w:pPr>
-      <w:proofErr w:type="spellStart"/>
-      <w:r>
-        <w:rPr>
-          <w:sz w:val="28"/>
-          <w:szCs w:val="28"/>
-        </w:rPr>
-        <w:t>Putalisadak</w:t>
-      </w:r>
-      <w:proofErr w:type="spellEnd"/>
-      <w:r>
-        <w:rPr>
-          <w:sz w:val="28"/>
-          <w:szCs w:val="28"/>
-        </w:rPr>
-        <w:t>, Kathmandu</w:t>
+        <w:t>Putalisadak, Kathmandu</w:t>
       </w:r>
     </w:p>
     <w:p>
@@ -989,15 +931,7 @@
     </w:p>
     <w:p>
       <w:r>
-        <w:t xml:space="preserve">Educational institutions often face difficulties in managing student complaints because traditional methods such as paper forms, emails, or manual records lead to delays, poor organization, and a lack of transparency in the complaint resolution process. To address these issues, this project proposes Student </w:t>
-      </w:r>
-      <w:proofErr w:type="spellStart"/>
-      <w:r>
-        <w:t>Complainify</w:t>
-      </w:r>
-      <w:proofErr w:type="spellEnd"/>
-      <w:r>
-        <w:t>, an AI-Based Student Complaint Analysis and Decision Support System that provides a centralized and user-friendly platform for handling student grievances. Through this system, students can submit complaints related to academics, examinations, administration, infrastructure, or faculty issues at any time and from any location. The system uses Artificial Intelligence techniques, including sentiment analysis and automatic text classification, to analyze the complaint content, identify its category, and determine its urgency level. Based on the analysis, complaints are automatically assigned priorities such as High, Medium, or Low and forwarded to the appropriate authorities for faster action. The system also includes an administrative dashboard that provides real-time complaint statistics, tracking facilities, filtering options, and report generation features to support effective decision-making. Additionally, an integrated email notification service keeps students updated about the status of their complaints and alerts administrators when high-priority issues are reported. Developed using the Waterfall Software Development Life Cycle model and implemented with technologies such as HTML, CSS, JavaScript, Python Flask, MySQL, and machine learning libraries, the proposed system aims to improve efficiency, enhance transparency, and ensure quicker and more effective resolution of student complaints in educational institutions.</w:t>
+        <w:t>Educational institutions often face difficulties in managing student complaints because traditional methods such as paper forms, emails, or manual records lead to delays, poor organization, and a lack of transparency in the complaint resolution process. To address these issues, this project proposes Student Complainify, an AI-Based Student Complaint Analysis and Decision Support System that provides a centralized and user-friendly platform for handling student grievances. Through this system, students can submit complaints related to academics, examinations, administration, infrastructure, or faculty issues at any time and from any location. The system uses Artificial Intelligence techniques, including sentiment analysis and automatic text classification, to analyze the complaint content, identify its category, and determine its urgency level. Based on the analysis, complaints are automatically assigned priorities such as High, Medium, or Low and forwarded to the appropriate authorities for faster action. The system also includes an administrative dashboard that provides real-time complaint statistics, tracking facilities, filtering options, and report generation features to support effective decision-making. Additionally, an integrated email notification service keeps students updated about the status of their complaints and alerts administrators when high-priority issues are reported. Developed using the Waterfall Software Development Life Cycle model and implemented with technologies such as HTML, CSS, JavaScript, Python Flask, MySQL, and machine learning libraries, the proposed system aims to improve efficiency, enhance transparency, and ensure quicker and more effective resolution of student complaints in educational institutions.</w:t>
       </w:r>
     </w:p>
     <w:p/>
@@ -1085,19 +1019,17 @@
     </w:p>
     <w:p>
       <w:r>
-        <w:t>We declare that this project report titled “</w:t>
-      </w:r>
-      <w:r>
-        <w:t xml:space="preserve"> Student </w:t>
-      </w:r>
-      <w:proofErr w:type="spellStart"/>
+        <w:t xml:space="preserve">We declare that this project report titled </w:t>
+      </w:r>
+      <w:r>
+        <w:t>“</w:t>
+      </w:r>
       <w:r>
         <w:t>C</w:t>
       </w:r>
       <w:r>
         <w:t>omplainify</w:t>
       </w:r>
-      <w:proofErr w:type="spellEnd"/>
       <w:r>
         <w:t>” submitted in partial fulfillment of the Bachelor of Information Technology is a record of original work carried out by us under the supervision of</w:t>
       </w:r>
@@ -1169,13 +1101,8 @@
         <w:t>This is to certify that the project entitled “</w:t>
       </w:r>
       <w:r>
-        <w:t xml:space="preserve">Student </w:t>
-      </w:r>
-      <w:proofErr w:type="spellStart"/>
-      <w:r>
         <w:t>Complainify</w:t>
       </w:r>
-      <w:proofErr w:type="spellEnd"/>
       <w:r>
         <w:t xml:space="preserve">” undertaken and demonstrated by Mridul Prakash Shah, Om Prakash Basnet and Samir Poudel has been successfully completed under my supervision as a partial fulfillment of the requirements of the degree of IT </w:t>
       </w:r>
@@ -1189,15 +1116,7 @@
         <w:t>th</w:t>
       </w:r>
       <w:r>
-        <w:t xml:space="preserve"> semester under </w:t>
-      </w:r>
-      <w:proofErr w:type="spellStart"/>
-      <w:r>
-        <w:t>Purbanchal</w:t>
-      </w:r>
-      <w:proofErr w:type="spellEnd"/>
-      <w:r>
-        <w:t xml:space="preserve"> University. I, henceforth, approve this project to be awarded the certificate by the concerned authority. During supervision, I found students hardworking, skilled and ready to undertake any professional work related to this field in future. </w:t>
+        <w:t xml:space="preserve"> semester under Purbanchal University. I, henceforth, approve this project to be awarded the certificate by the concerned authority. During supervision, I found students hardworking, skilled and ready to undertake any professional work related to this field in future. </w:t>
       </w:r>
     </w:p>
     <w:p>
@@ -1410,13 +1329,8 @@
         <w:t>Following the Supervisor's Approval and Examiner’s Acceptance, the project entitled “</w:t>
       </w:r>
       <w:r>
-        <w:t xml:space="preserve">Student </w:t>
-      </w:r>
-      <w:proofErr w:type="spellStart"/>
-      <w:r>
         <w:t>Complainify</w:t>
       </w:r>
-      <w:proofErr w:type="spellEnd"/>
       <w:r>
         <w:t xml:space="preserve">” submitted by Mridul Prakash Shah, Om Prakash Basnet and Samir Poudel as a partial fulfillment of the requirements for the degree of BIT </w:t>
       </w:r>
@@ -1430,15 +1344,7 @@
         <w:t>th</w:t>
       </w:r>
       <w:r>
-        <w:t xml:space="preserve"> Semester under </w:t>
-      </w:r>
-      <w:proofErr w:type="spellStart"/>
-      <w:r>
-        <w:t>Purbanchal</w:t>
-      </w:r>
-      <w:proofErr w:type="spellEnd"/>
-      <w:r>
-        <w:t xml:space="preserve"> University, has been officially awarded by this certificate. I wish the students all the best for their future endeavors. </w:t>
+        <w:t xml:space="preserve"> Semester under Purbanchal University, has been officially awarded by this certificate. I wish the students all the best for their future endeavors. </w:t>
       </w:r>
     </w:p>
     <w:p>
@@ -9827,15 +9733,7 @@
       </w:pPr>
       <w:bookmarkStart w:id="18" w:name="_Toc230940518"/>
       <w:r>
-        <w:t xml:space="preserve">Student </w:t>
-      </w:r>
-      <w:proofErr w:type="spellStart"/>
-      <w:r>
-        <w:t>Complainify</w:t>
-      </w:r>
-      <w:proofErr w:type="spellEnd"/>
-      <w:r>
-        <w:t xml:space="preserve"> is an AI-Based Student Complaint Analysis and Decision Support System developed to automate the management of student complaints in educational institutions. Traditional complaint handling methods, such as paper forms and manual records, often lead to delayed responses, improper categorization, and a lack of transparency. To overcome these issues, the proposed system provides a centralized web-based platform where students can submit and track complaints efficiently. The system applies concepts from Artificial Intelligence and Data Mining, including Natural Language Processing (NLP), text classification, and sentiment analysis. When a complaint is submitted, the text is preprocessed and classified into categories such as Academic, Examination, Infrastructure, or Administration using the </w:t>
+        <w:t xml:space="preserve">Complainify is an AI-Based Student Complaint Analysis and Decision Support System developed to automate the management of student complaints in educational institutions. Traditional complaint handling methods, such as paper forms and manual records, often lead to delayed responses, improper categorization, and a lack of transparency. To overcome these issues, the proposed system provides a centralized web-based platform where students can submit and track complaints efficiently. The system applies concepts from Artificial Intelligence and Data Mining, including Natural Language Processing (NLP), text classification, and sentiment analysis. When a complaint is submitted, the text is preprocessed and classified into categories such as Academic, Examination, Infrastructure, or Administration using the </w:t>
       </w:r>
       <w:r>
         <w:rPr>
@@ -9992,13 +9890,8 @@
     </w:p>
     <w:p>
       <w:r>
-        <w:t xml:space="preserve">Student </w:t>
-      </w:r>
-      <w:proofErr w:type="spellStart"/>
-      <w:r>
-        <w:t>Complainify</w:t>
-      </w:r>
-      <w:proofErr w:type="spellEnd"/>
+        <w:t>Student Complainify</w:t>
+      </w:r>
       <w:r>
         <w:t xml:space="preserve"> is designed with several features to ensure usability, efficiency, and reliability:</w:t>
       </w:r>
@@ -10188,15 +10081,7 @@
         <w:t>Email Notification System:</w:t>
       </w:r>
       <w:r>
-        <w:t xml:space="preserve"> Automated email notifications are sent for complaint submission confirmations, status updates, high-priority complaint alerts, and resolution notifications using </w:t>
-      </w:r>
-      <w:proofErr w:type="spellStart"/>
-      <w:r>
-        <w:t>PHPMailer</w:t>
-      </w:r>
-      <w:proofErr w:type="spellEnd"/>
-      <w:r>
-        <w:t xml:space="preserve"> and SMTP services.</w:t>
+        <w:t xml:space="preserve"> Automated email notifications are sent for complaint submission confirmations, status updates, high-priority complaint alerts, and resolution notifications using PHPMailer and SMTP services.</w:t>
       </w:r>
     </w:p>
     <w:p>
@@ -10287,15 +10172,7 @@
     </w:p>
     <w:p>
       <w:r>
-        <w:t xml:space="preserve">Student </w:t>
-      </w:r>
-      <w:proofErr w:type="spellStart"/>
-      <w:r>
-        <w:t>Complainify</w:t>
-      </w:r>
-      <w:proofErr w:type="spellEnd"/>
-      <w:r>
-        <w:t xml:space="preserve"> is significant because it provides an intelligent and centralized platform for managing student grievances efficiently by automating complaint submission, classification, prioritization, and tracking. The system improves transparency and communication between students and administrators through real-time status updates and email notifications while reducing manual effort and delays in complaint resolution. By integrating Artificial Intelligence and Data Mining techniques such as text classification, sentiment analysis, and pattern discovery, the system helps institutions identify recurring issues, analyze complaint trends, and make informed decisions through analytical dashboards and reports. The project demonstrates the practical application of AI and Data Mining concepts in solving real-world problems and contributes to improving student satisfaction and institutional performance.</w:t>
+        <w:t>Student Complainify is significant because it provides an intelligent and centralized platform for managing student grievances efficiently by automating complaint submission, classification, prioritization, and tracking. The system improves transparency and communication between students and administrators through real-time status updates and email notifications while reducing manual effort and delays in complaint resolution. By integrating Artificial Intelligence and Data Mining techniques such as text classification, sentiment analysis, and pattern discovery, the system helps institutions identify recurring issues, analyze complaint trends, and make informed decisions through analytical dashboards and reports. The project demonstrates the practical application of AI and Data Mining concepts in solving real-world problems and contributes to improving student satisfaction and institutional performance.</w:t>
       </w:r>
       <w:bookmarkStart w:id="22" w:name="_Toc230940522"/>
     </w:p>
@@ -10325,15 +10202,7 @@
     </w:p>
     <w:p>
       <w:r>
-        <w:t xml:space="preserve">The scope of Student </w:t>
-      </w:r>
-      <w:proofErr w:type="spellStart"/>
-      <w:r>
-        <w:t>Complainify</w:t>
-      </w:r>
-      <w:proofErr w:type="spellEnd"/>
-      <w:r>
-        <w:t xml:space="preserve"> is to develop a web-based intelligent complaint management system that allows students to submit and track complaints while enabling administrators to manage and analyze them efficiently. The system uses Artificial Intelligence and Data Mining techniques such as Natural Language Processing, Naïve Bayes Classification, and sentiment analysis to categorize complaints, assign priorities, generate reports, and provide email notifications, thereby improving transparency and supporting data-driven decision-making in educational institutions.</w:t>
+        <w:t>The scope of Student Complainify is to develop a web-based intelligent complaint management system that allows students to submit and track complaints while enabling administrators to manage and analyze them efficiently. The system uses Artificial Intelligence and Data Mining techniques such as Natural Language Processing, Naïve Bayes Classification, and sentiment analysis to categorize complaints, assign priorities, generate reports, and provide email notifications, thereby improving transparency and supporting data-driven decision-making in educational institutions.</w:t>
       </w:r>
     </w:p>
     <w:p/>
@@ -11213,15 +11082,7 @@
     </w:p>
     <w:p>
       <w:r>
-        <w:t xml:space="preserve">For the development of Student </w:t>
-      </w:r>
-      <w:proofErr w:type="spellStart"/>
-      <w:r>
-        <w:t>Complainify</w:t>
-      </w:r>
-      <w:proofErr w:type="spellEnd"/>
-      <w:r>
-        <w:t>:</w:t>
+        <w:t>For the development of Student Complainify:</w:t>
       </w:r>
       <w:r>
         <w:t xml:space="preserve"> </w:t>
@@ -11260,15 +11121,7 @@
         <w:ind w:left="720"/>
       </w:pPr>
       <w:r>
-        <w:t xml:space="preserve">The Student submission, complaint classification, sentiment analysis, priority assignment, dashboard generation, and email notifications. Since these requirements remain stable throughout development, the Waterfall Model is suitable for the </w:t>
-      </w:r>
-      <w:proofErr w:type="spellStart"/>
-      <w:r>
-        <w:t>project.Complainify</w:t>
-      </w:r>
-      <w:proofErr w:type="spellEnd"/>
-      <w:r>
-        <w:t xml:space="preserve"> system has well-defined requirements such as user registration, complaint </w:t>
+        <w:t xml:space="preserve">The Student submission, complaint classification, sentiment analysis, priority assignment, dashboard generation, and email notifications. Since these requirements remain stable throughout development, the Waterfall Model is suitable for the project.Complainify system has well-defined requirements such as user registration, complaint </w:t>
       </w:r>
     </w:p>
     <w:p>
@@ -11494,13 +11347,8 @@
     </w:p>
     <w:p>
       <w:r>
-        <w:t xml:space="preserve">The </w:t>
-      </w:r>
-      <w:proofErr w:type="spellStart"/>
-      <w:r>
-        <w:t>MedTracker</w:t>
-      </w:r>
-      <w:proofErr w:type="spellEnd"/>
+        <w:t>The MedTracker</w:t>
+      </w:r>
       <w:r>
         <w:t xml:space="preserve"> </w:t>
       </w:r>
@@ -11522,15 +11370,7 @@
     </w:p>
     <w:p>
       <w:r>
-        <w:t xml:space="preserve">HTML is used to structure the web pages of the </w:t>
-      </w:r>
-      <w:proofErr w:type="spellStart"/>
-      <w:r>
-        <w:t>MedTracker</w:t>
-      </w:r>
-      <w:proofErr w:type="spellEnd"/>
-      <w:r>
-        <w:t xml:space="preserve"> system. It defines the layout of forms, dashboards, and medicine management interfaces, allowing users to easily enter and view medication details in an organized manner.CSS is used to design and style the user interface. It helps create a clean, readable, and user-friendly layout, ensuring that the system is visually simple and accessible for all users, including elderly patients. JavaScript is used to add interactivity and dynamic behavior to the system. It handles form validation, alerts, and responsive features </w:t>
+        <w:t xml:space="preserve">HTML is used to structure the web pages of the MedTracker system. It defines the layout of forms, dashboards, and medicine management interfaces, allowing users to easily enter and view medication details in an organized manner.CSS is used to design and style the user interface. It helps create a clean, readable, and user-friendly layout, ensuring that the system is visually simple and accessible for all users, including elderly patients. JavaScript is used to add interactivity and dynamic behavior to the system. It handles form validation, alerts, and responsive features </w:t>
       </w:r>
       <w:r>
         <w:lastRenderedPageBreak/>
@@ -11551,15 +11391,7 @@
     </w:p>
     <w:p>
       <w:r>
-        <w:t xml:space="preserve">MySQL is used as the database management system for </w:t>
-      </w:r>
-      <w:proofErr w:type="spellStart"/>
-      <w:r>
-        <w:t>MedTracker</w:t>
-      </w:r>
-      <w:proofErr w:type="spellEnd"/>
-      <w:r>
-        <w:t>. It stores all system data such as user accounts, medicine details, schedules, and intake records. The database is designed with properly related tables to maintain data consistency and allow efficient storage and retrieval of medication information.</w:t>
+        <w:t>MySQL is used as the database management system for MedTracker. It stores all system data such as user accounts, medicine details, schedules, and intake records. The database is designed with properly related tables to maintain data consistency and allow efficient storage and retrieval of medication information.</w:t>
       </w:r>
     </w:p>
     <w:p>
@@ -11582,39 +11414,7 @@
     </w:p>
     <w:p>
       <w:r>
-        <w:t xml:space="preserve">Several additional tools were integrated to enhance system functionality. </w:t>
-      </w:r>
-      <w:proofErr w:type="spellStart"/>
-      <w:r>
-        <w:t>PHPMailer</w:t>
-      </w:r>
-      <w:proofErr w:type="spellEnd"/>
-      <w:r>
-        <w:t xml:space="preserve"> is used for sending email reminders, and the </w:t>
-      </w:r>
-      <w:proofErr w:type="spellStart"/>
-      <w:r>
-        <w:t>TextBee</w:t>
-      </w:r>
-      <w:proofErr w:type="spellEnd"/>
-      <w:r>
-        <w:t xml:space="preserve"> API is used for SMS notifications. Chart.js is used to display reports and analytics, while </w:t>
-      </w:r>
-      <w:proofErr w:type="spellStart"/>
-      <w:r>
-        <w:t>jsPDF</w:t>
-      </w:r>
-      <w:proofErr w:type="spellEnd"/>
-      <w:r>
-        <w:t xml:space="preserve"> is used to generate downloadable PDF reports. Task schedulers are used to automate reminder notifications and </w:t>
-      </w:r>
-      <w:proofErr w:type="spellStart"/>
-      <w:r>
-        <w:t>Jitsi</w:t>
-      </w:r>
-      <w:proofErr w:type="spellEnd"/>
-      <w:r>
-        <w:t xml:space="preserve"> Meet is used for video conference call between patient and health worker.</w:t>
+        <w:t>Several additional tools were integrated to enhance system functionality. PHPMailer is used for sending email reminders, and the TextBee API is used for SMS notifications. Chart.js is used to display reports and analytics, while jsPDF is used to generate downloadable PDF reports. Task schedulers are used to automate reminder notifications and Jitsi Meet is used for video conference call between patient and health worker.</w:t>
       </w:r>
     </w:p>
     <w:p>
@@ -11847,15 +11647,7 @@
               <w:spacing w:line="360" w:lineRule="auto"/>
             </w:pPr>
             <w:r>
-              <w:t>XAMPP server configuration and .</w:t>
-            </w:r>
-            <w:proofErr w:type="spellStart"/>
-            <w:r>
-              <w:t>htaccess</w:t>
-            </w:r>
-            <w:proofErr w:type="spellEnd"/>
-            <w:r>
-              <w:t xml:space="preserve"> setup</w:t>
+              <w:t>XAMPP server configuration and .htaccess setup</w:t>
             </w:r>
           </w:p>
           <w:p>
@@ -12051,15 +11843,7 @@
               <w:spacing w:line="360" w:lineRule="auto"/>
             </w:pPr>
             <w:r>
-              <w:t xml:space="preserve">JavaScript (script.js) app initialization, </w:t>
-            </w:r>
-            <w:proofErr w:type="spellStart"/>
-            <w:r>
-              <w:t>localStorage</w:t>
-            </w:r>
-            <w:proofErr w:type="spellEnd"/>
-            <w:r>
-              <w:t xml:space="preserve"> session, logout</w:t>
+              <w:t>JavaScript (script.js) app initialization, localStorage session, logout</w:t>
             </w:r>
           </w:p>
           <w:p>
@@ -12523,13 +12307,8 @@
       <w:bookmarkEnd w:id="54"/>
     </w:p>
     <w:p>
-      <w:proofErr w:type="spellStart"/>
-      <w:r>
-        <w:t>MedTracker</w:t>
-      </w:r>
-      <w:proofErr w:type="spellEnd"/>
-      <w:r>
-        <w:t xml:space="preserve"> was developed to address the growing need for efficient medication management and adherence tracking across personal and clinical healthcare settings. The requirements were gathered through analysis of existing medication reminder systems, consultation with the multi-role user ecosystem — patients, health workers, and administrators — and study of real-world challenges faced by individuals managing complex medication schedules. The system aims to bridge the gap between patients and their healthcare providers by offering a centralized, role-based platform for medication scheduling, intake logging, adherence monitoring, stock tracking, and care coordination.</w:t>
+      <w:r>
+        <w:t>MedTracker was developed to address the growing need for efficient medication management and adherence tracking across personal and clinical healthcare settings. The requirements were gathered through analysis of existing medication reminder systems, consultation with the multi-role user ecosystem — patients, health workers, and administrators — and study of real-world challenges faced by individuals managing complex medication schedules. The system aims to bridge the gap between patients and their healthcare providers by offering a centralized, role-based platform for medication scheduling, intake logging, adherence monitoring, stock tracking, and care coordination.</w:t>
       </w:r>
     </w:p>
     <w:p>
@@ -13325,15 +13104,7 @@
               <w:spacing w:line="360" w:lineRule="auto"/>
             </w:pPr>
             <w:r>
-              <w:t xml:space="preserve">Patients and Health Workers shall communicate through an integrated consultation room that supports real-time text messaging, embedded video calls via </w:t>
-            </w:r>
-            <w:proofErr w:type="spellStart"/>
-            <w:r>
-              <w:t>Jitsi</w:t>
-            </w:r>
-            <w:proofErr w:type="spellEnd"/>
-            <w:r>
-              <w:t xml:space="preserve"> Meet, and structured appointment scheduling. Health Workers shall be able to set their availability status with an optional note, and patients shall view their linked doctor's availability before initiating a session. The contact panel shall display only role-relevant contacts, ensuring patients see only their linked health workers and vice versa.</w:t>
+              <w:t>Patients and Health Workers shall communicate through an integrated consultation room that supports real-time text messaging, embedded video calls via Jitsi Meet, and structured appointment scheduling. Health Workers shall be able to set their availability status with an optional note, and patients shall view their linked doctor's availability before initiating a session. The contact panel shall display only role-relevant contacts, ensuring patients see only their linked health workers and vice versa.</w:t>
             </w:r>
           </w:p>
         </w:tc>
@@ -13403,15 +13174,7 @@
     </w:p>
     <w:p>
       <w:r>
-        <w:t xml:space="preserve">The functional requirements define the specific behaviors and operations the system must perform to meet user needs and business objectives. Each functional requirement is mapped to one or more gathered requirements to ensure full coverage. Table 4.2 details all functional requirements for </w:t>
-      </w:r>
-      <w:proofErr w:type="spellStart"/>
-      <w:r>
-        <w:t>MedTracker</w:t>
-      </w:r>
-      <w:proofErr w:type="spellEnd"/>
-      <w:r>
-        <w:t>.</w:t>
+        <w:t>The functional requirements define the specific behaviors and operations the system must perform to meet user needs and business objectives. Each functional requirement is mapped to one or more gathered requirements to ensure full coverage. Table 4.2 details all functional requirements for MedTracker.</w:t>
       </w:r>
     </w:p>
     <w:p>
@@ -14686,15 +14449,7 @@
               <w:spacing w:line="360" w:lineRule="auto"/>
             </w:pPr>
             <w:r>
-              <w:t xml:space="preserve">Video Consultation: Patients and Health Workers shall communicate through a shared consultation room supporting real-time text messaging, video calls powered by </w:t>
-            </w:r>
-            <w:proofErr w:type="spellStart"/>
-            <w:r>
-              <w:t>Jitsi</w:t>
-            </w:r>
-            <w:proofErr w:type="spellEnd"/>
-            <w:r>
-              <w:t xml:space="preserve"> Meet, and structured appointment scheduling. Health Workers shall be able to set their availability status with an optional note. Patients shall view their linked doctor’s availability status before initiating a session. Both roles shall send and receive messages and book or view appointments within the platform.</w:t>
+              <w:t>Video Consultation: Patients and Health Workers shall communicate through a shared consultation room supporting real-time text messaging, video calls powered by Jitsi Meet, and structured appointment scheduling. Health Workers shall be able to set their availability status with an optional note. Patients shall view their linked doctor’s availability status before initiating a session. Both roles shall send and receive messages and book or view appointments within the platform.</w:t>
             </w:r>
           </w:p>
         </w:tc>
@@ -14796,48 +14551,16 @@
     </w:p>
     <w:p>
       <w:r>
-        <w:t xml:space="preserve">The technical feasibility analysis confirms that </w:t>
-      </w:r>
-      <w:proofErr w:type="spellStart"/>
-      <w:r>
-        <w:t>MedTracker</w:t>
-      </w:r>
-      <w:proofErr w:type="spellEnd"/>
-      <w:r>
-        <w:t xml:space="preserve"> can be developed effectively with the technology stack and skills available to the development team. The system is built on widely adopted and well-documented technologies including HTML5, CSS3, JavaScript, PHP, and </w:t>
+        <w:t xml:space="preserve">The technical feasibility analysis confirms that MedTracker can be developed effectively with the technology stack and skills available to the development team. The system is built on widely adopted and well-documented technologies including HTML5, CSS3, JavaScript, PHP, and </w:t>
       </w:r>
       <w:r>
         <w:t>MySQL all</w:t>
       </w:r>
       <w:r>
-        <w:t xml:space="preserve"> of which are free to use and supported by large developer communities. The team possesses the required knowledge of frontend development, backend API design, relational database management, and REST communication. Additional integrations such as the </w:t>
-      </w:r>
-      <w:proofErr w:type="spellStart"/>
-      <w:r>
-        <w:t>TextBee</w:t>
-      </w:r>
-      <w:proofErr w:type="spellEnd"/>
-      <w:r>
-        <w:t xml:space="preserve"> API for SMS and SMTP for email are well-documented and straightforward to configure. The system is designed to run on standard web hosting infrastructure without requiring specialized hardware. A modular architecture ensures that individual components such as the notification engine, reporting module, and dose tracker can be developed, tested, and maintained independently. Therefore, </w:t>
-      </w:r>
-      <w:proofErr w:type="spellStart"/>
-      <w:r>
-        <w:t>MedTracker</w:t>
-      </w:r>
-      <w:proofErr w:type="spellEnd"/>
-      <w:r>
-        <w:t xml:space="preserve"> is technically feasible. </w:t>
-      </w:r>
-      <w:r>
-        <w:t xml:space="preserve">The Video Consultation module is built using </w:t>
-      </w:r>
-      <w:proofErr w:type="spellStart"/>
-      <w:r>
-        <w:t>Jitsi</w:t>
-      </w:r>
-      <w:proofErr w:type="spellEnd"/>
-      <w:r>
-        <w:t xml:space="preserve"> Meet, a free and open-source video conferencing solution that </w:t>
+        <w:t xml:space="preserve"> of which are free to use and supported by large developer communities. The team possesses the required knowledge of frontend development, backend API design, relational database management, and REST communication. Additional integrations such as the TextBee API for SMS and SMTP for email are well-documented and straightforward to configure. The system is designed to run on standard web hosting infrastructure without requiring specialized hardware. A modular architecture ensures that individual components such as the notification engine, reporting module, and dose tracker can be developed, tested, and maintained independently. Therefore, MedTracker is technically feasible. </w:t>
+      </w:r>
+      <w:r>
+        <w:t xml:space="preserve">The Video Consultation module is built using Jitsi Meet, a free and open-source video conferencing solution that </w:t>
       </w:r>
       <w:r>
         <w:lastRenderedPageBreak/>
@@ -14858,37 +14581,13 @@
     </w:p>
     <w:p>
       <w:r>
-        <w:t xml:space="preserve">The operational feasibility analysis shows that </w:t>
-      </w:r>
-      <w:proofErr w:type="spellStart"/>
-      <w:r>
-        <w:t>MedTracker</w:t>
-      </w:r>
-      <w:proofErr w:type="spellEnd"/>
-      <w:r>
-        <w:t xml:space="preserve"> will be readily accepted and effectively used by its three primary user groups. The system resolves critical pain points: patients frequently forget doses or lose track of their stock, doctors lack a direct channel to monitor their patients' adherence, and administrators have no centralized view of system-wide medication activity. </w:t>
-      </w:r>
-      <w:proofErr w:type="spellStart"/>
-      <w:r>
-        <w:t>MedTracker</w:t>
-      </w:r>
-      <w:proofErr w:type="spellEnd"/>
-      <w:r>
-        <w:t xml:space="preserve"> addresses each of these with intuitive role-specific dashboards, automated reminders, stock alerts, and a comprehensive admin panel. The interface uses familiar web UI patterns, requiring minimal training for first-time users. The multi-role architecture means that patients, doctors, and administrators each see only what is relevant to them, reducing cognitive overhead. Privacy controls ensure that doctors cannot access another doctor's prescriptions, building trust across the user base. The system is browser-based and does not require installation, making adoption straightforward across devices. </w:t>
+        <w:t xml:space="preserve">The operational feasibility analysis shows that MedTracker will be readily accepted and effectively used by its three primary user groups. The system resolves critical pain points: patients frequently forget doses or lose track of their stock, doctors lack a direct channel to monitor their patients' adherence, and administrators have no centralized view of system-wide medication activity. MedTracker addresses each of these with intuitive role-specific dashboards, automated reminders, stock alerts, and a comprehensive admin panel. The interface uses familiar web UI patterns, requiring minimal training for first-time users. The multi-role architecture means that patients, doctors, and administrators each see only what is relevant to them, reducing cognitive overhead. Privacy controls ensure that doctors cannot access another doctor's prescriptions, building trust across the user base. The system is browser-based and does not require installation, making adoption straightforward across devices. </w:t>
       </w:r>
       <w:r>
         <w:t>The Video Consultation module directly addresses a key gap in patient-doctor communication by eliminating the need for in-person visits for routine follow-ups. Patients can check their doctor's availability status before initiating a session, reducing wasted attempts. The familiar chat and video call interface requires minimal learning effort for both patients and health workers, fitting naturally into their existing care workflow.</w:t>
       </w:r>
       <w:r>
-        <w:t xml:space="preserve"> Overall, </w:t>
-      </w:r>
-      <w:proofErr w:type="spellStart"/>
-      <w:r>
-        <w:t>MedTracker</w:t>
-      </w:r>
-      <w:proofErr w:type="spellEnd"/>
-      <w:r>
-        <w:t xml:space="preserve"> fits naturally into existing healthcare and personal health management workflows and is operationally feasible.</w:t>
+        <w:t xml:space="preserve"> Overall, MedTracker fits naturally into existing healthcare and personal health management workflows and is operationally feasible.</w:t>
       </w:r>
     </w:p>
     <w:p>
@@ -14904,13 +14603,8 @@
       <w:bookmarkEnd w:id="66"/>
     </w:p>
     <w:p>
-      <w:proofErr w:type="spellStart"/>
-      <w:r>
-        <w:t>MedTracker</w:t>
-      </w:r>
-      <w:proofErr w:type="spellEnd"/>
-      <w:r>
-        <w:t xml:space="preserve"> is economically feasible and demonstrates strong financial viability. The project requires an initial investment of NPR 175,000 covering labor, documentation, hardware, API setup, training, and contingency. Annual operating costs range from NPR 31,000 in Year 1 to NPR 40,000 by Year 5, covering hosting, </w:t>
+      <w:r>
+        <w:t xml:space="preserve">MedTracker is economically feasible and demonstrates strong financial viability. The project requires an initial investment of NPR 175,000 covering labor, documentation, hardware, API setup, training, and contingency. Annual operating costs range from NPR 31,000 in Year 1 to NPR 40,000 by Year 5, covering hosting, </w:t>
       </w:r>
       <w:r>
         <w:lastRenderedPageBreak/>
@@ -15179,21 +14873,8 @@
               <w:spacing w:line="360" w:lineRule="auto"/>
               <w:jc w:val="left"/>
             </w:pPr>
-            <w:proofErr w:type="spellStart"/>
-            <w:r>
-              <w:t>TextBee</w:t>
-            </w:r>
-            <w:proofErr w:type="spellEnd"/>
-            <w:r>
-              <w:t xml:space="preserve">, </w:t>
-            </w:r>
-            <w:proofErr w:type="spellStart"/>
-            <w:r>
-              <w:t>Jitsi</w:t>
-            </w:r>
-            <w:proofErr w:type="spellEnd"/>
-            <w:r>
-              <w:t xml:space="preserve"> Meet SMTP initial configuration and credits</w:t>
+            <w:r>
+              <w:t>TextBee, Jitsi Meet SMTP initial configuration and credits</w:t>
             </w:r>
           </w:p>
         </w:tc>
@@ -16539,15 +16220,7 @@
     </w:p>
     <w:p>
       <w:r>
-        <w:t xml:space="preserve">From a commercial perspective, </w:t>
-      </w:r>
-      <w:proofErr w:type="spellStart"/>
-      <w:r>
-        <w:t>MedTracker</w:t>
-      </w:r>
-      <w:proofErr w:type="spellEnd"/>
-      <w:r>
-        <w:t xml:space="preserve"> has strong market potential. Its key features include:</w:t>
+        <w:t>From a commercial perspective, MedTracker has strong market potential. Its key features include:</w:t>
       </w:r>
     </w:p>
     <w:p>
@@ -16671,15 +16344,7 @@
     </w:p>
     <w:p>
       <w:r>
-        <w:t xml:space="preserve">The economic analysis shows that </w:t>
-      </w:r>
-      <w:proofErr w:type="spellStart"/>
-      <w:r>
-        <w:t>MedTracker</w:t>
-      </w:r>
-      <w:proofErr w:type="spellEnd"/>
-      <w:r>
-        <w:t xml:space="preserve"> is financially sound. It offers:</w:t>
+        <w:t>The economic analysis shows that MedTracker is financially sound. It offers:</w:t>
       </w:r>
     </w:p>
     <w:p>
@@ -16877,13 +16542,8 @@
       <w:bookmarkEnd w:id="75"/>
     </w:p>
     <w:p>
-      <w:proofErr w:type="spellStart"/>
-      <w:r>
-        <w:t>MedTracker</w:t>
-      </w:r>
-      <w:proofErr w:type="spellEnd"/>
-      <w:r>
-        <w:t xml:space="preserve"> follows a multi-tier architecture that separates the presentation layer, business logic layer, data access layer, and external integration layer. This architectural pattern ensures modularity, maintainability, and scalability of the system. Each layer has a well-defined responsibility and communicates with adjacent layers through clearly defined interfaces, preventing tight coupling and enabling independent modification of any layer.</w:t>
+      <w:r>
+        <w:t>MedTracker follows a multi-tier architecture that separates the presentation layer, business logic layer, data access layer, and external integration layer. This architectural pattern ensures modularity, maintainability, and scalability of the system. Each layer has a well-defined responsibility and communicates with adjacent layers through clearly defined interfaces, preventing tight coupling and enabling independent modification of any layer.</w:t>
       </w:r>
       <w:r>
         <w:t xml:space="preserve"> The architecture tier layer is described in architectural components below</w:t>
@@ -17235,24 +16895,11 @@
               <w:spacing w:line="360" w:lineRule="auto"/>
               <w:jc w:val="left"/>
             </w:pPr>
-            <w:proofErr w:type="spellStart"/>
-            <w:r>
-              <w:t>TextBee</w:t>
-            </w:r>
-            <w:proofErr w:type="spellEnd"/>
-            <w:r>
-              <w:t xml:space="preserve"> API, SMTP (Email), SMS Gateway,</w:t>
-            </w:r>
-            <w:r>
-              <w:t xml:space="preserve"> </w:t>
-            </w:r>
-            <w:proofErr w:type="spellStart"/>
-            <w:r>
-              <w:t>Jitsi</w:t>
-            </w:r>
-            <w:proofErr w:type="spellEnd"/>
-            <w:r>
-              <w:t xml:space="preserve"> Meet</w:t>
+            <w:r>
+              <w:t>TextBee API, SMTP (Email), SMS Gateway,</w:t>
+            </w:r>
+            <w:r>
+              <w:t xml:space="preserve"> Jitsi Meet</w:t>
             </w:r>
             <w:r>
               <w:t xml:space="preserve"> </w:t>
@@ -19562,7 +19209,6 @@
         </w:numPr>
         <w:contextualSpacing/>
       </w:pPr>
-      <w:proofErr w:type="spellStart"/>
       <w:r>
         <w:rPr>
           <w:b/>
@@ -19570,7 +19216,6 @@
         </w:rPr>
         <w:t>PHPMailer</w:t>
       </w:r>
-      <w:proofErr w:type="spellEnd"/>
       <w:r>
         <w:t xml:space="preserve"> → Used to send email reminders.</w:t>
       </w:r>
@@ -19621,7 +19266,6 @@
         </w:numPr>
         <w:contextualSpacing/>
       </w:pPr>
-      <w:proofErr w:type="spellStart"/>
       <w:r>
         <w:rPr>
           <w:b/>
@@ -19629,7 +19273,6 @@
         </w:rPr>
         <w:t>jsPDF</w:t>
       </w:r>
-      <w:proofErr w:type="spellEnd"/>
       <w:r>
         <w:t xml:space="preserve"> → Used to generate PDF reports.</w:t>
       </w:r>
@@ -19642,22 +19285,13 @@
         </w:numPr>
         <w:contextualSpacing/>
       </w:pPr>
-      <w:proofErr w:type="spellStart"/>
       <w:r>
         <w:rPr>
           <w:b/>
           <w:bCs/>
         </w:rPr>
         <w:lastRenderedPageBreak/>
-        <w:t>Jitsi</w:t>
-      </w:r>
-      <w:proofErr w:type="spellEnd"/>
-      <w:r>
-        <w:rPr>
-          <w:b/>
-          <w:bCs/>
-        </w:rPr>
-        <w:t xml:space="preserve"> Meet</w:t>
+        <w:t>Jitsi Meet</w:t>
       </w:r>
       <w:r>
         <w:t>→ Used for video conference between Patient/User and Health Worker.</w:t>
@@ -19671,7 +19305,6 @@
         </w:numPr>
         <w:contextualSpacing/>
       </w:pPr>
-      <w:proofErr w:type="spellStart"/>
       <w:r>
         <w:rPr>
           <w:b/>
@@ -19679,7 +19312,6 @@
         </w:rPr>
         <w:t>TextBee</w:t>
       </w:r>
-      <w:proofErr w:type="spellEnd"/>
       <w:r>
         <w:rPr>
           <w:b/>
@@ -19985,13 +19617,8 @@
       <w:bookmarkEnd w:id="117"/>
     </w:p>
     <w:p>
-      <w:proofErr w:type="spellStart"/>
-      <w:r>
-        <w:t>MedTracker</w:t>
-      </w:r>
-      <w:proofErr w:type="spellEnd"/>
-      <w:r>
-        <w:t xml:space="preserve"> was tested using a multi-level testing strategy covering unit testing, integration testing, and user acceptance testing. Unit tests verified the correctness of individual API endpoints and form validation logic in isolation. Integration tests confirmed that frontend pages correctly communicate with backend endpoints and that data flows as expected from user input through to database storage. User acceptance testing was performed by simulating real-world usage scenarios for each of the three user roles Patient, Health Worker, and Admin to confirm that the system behaves correctly from an end-user perspective.</w:t>
+      <w:r>
+        <w:t>MedTracker was tested using a multi-level testing strategy covering unit testing, integration testing, and user acceptance testing. Unit tests verified the correctness of individual API endpoints and form validation logic in isolation. Integration tests confirmed that frontend pages correctly communicate with backend endpoints and that data flows as expected from user input through to database storage. User acceptance testing was performed by simulating real-world usage scenarios for each of the three user roles Patient, Health Worker, and Admin to confirm that the system behaves correctly from an end-user perspective.</w:t>
       </w:r>
     </w:p>
     <w:p>
@@ -20308,23 +19935,7 @@
               <w:spacing w:line="360" w:lineRule="auto"/>
             </w:pPr>
             <w:r>
-              <w:t xml:space="preserve">This API tool was used for testing SMS notification delivery tested using registered test phone numbers for </w:t>
-            </w:r>
-            <w:proofErr w:type="spellStart"/>
-            <w:r>
-              <w:t>TextBee</w:t>
-            </w:r>
-            <w:proofErr w:type="spellEnd"/>
-            <w:r>
-              <w:t xml:space="preserve"> and for testing email notifications with real Gmail addresses to verify formatting, delivery, and error handling for </w:t>
-            </w:r>
-            <w:proofErr w:type="spellStart"/>
-            <w:r>
-              <w:t>phpmailer</w:t>
-            </w:r>
-            <w:proofErr w:type="spellEnd"/>
-            <w:r>
-              <w:t xml:space="preserve"> library.</w:t>
+              <w:t>This API tool was used for testing SMS notification delivery tested using registered test phone numbers for TextBee and for testing email notifications with real Gmail addresses to verify formatting, delivery, and error handling for phpmailer library.</w:t>
             </w:r>
           </w:p>
         </w:tc>
@@ -20353,21 +19964,7 @@
         <w:rPr>
           <w:spacing w:val="-2"/>
         </w:rPr>
-        <w:t xml:space="preserve">The following tables document test cases organized by module. Each test case records the test ID, description, input conditions, expected output, actual output observed during testing, and the final status (Pass or Fail). Where initial failures were encountered during development cycles, they have been resolved and confirmed as Pass in the final build. The test IDs follow the </w:t>
-      </w:r>
-      <w:proofErr w:type="spellStart"/>
-      <w:r>
-        <w:rPr>
-          <w:spacing w:val="-2"/>
-        </w:rPr>
-        <w:t>ModuleNumber.TestNumber</w:t>
-      </w:r>
-      <w:proofErr w:type="spellEnd"/>
-      <w:r>
-        <w:rPr>
-          <w:spacing w:val="-2"/>
-        </w:rPr>
-        <w:t xml:space="preserve"> for easy cross-referencing.</w:t>
+        <w:t>The following tables document test cases organized by module. Each test case records the test ID, description, input conditions, expected output, actual output observed during testing, and the final status (Pass or Fail). Where initial failures were encountered during development cycles, they have been resolved and confirmed as Pass in the final build. The test IDs follow the ModuleNumber.TestNumber for easy cross-referencing.</w:t>
       </w:r>
     </w:p>
     <w:p>
@@ -28798,15 +28395,7 @@
               <w:jc w:val="left"/>
             </w:pPr>
             <w:r>
-              <w:t xml:space="preserve">Join </w:t>
-            </w:r>
-            <w:proofErr w:type="spellStart"/>
-            <w:r>
-              <w:t>Jitsi</w:t>
-            </w:r>
-            <w:proofErr w:type="spellEnd"/>
-            <w:r>
-              <w:t xml:space="preserve"> Meet video call</w:t>
+              <w:t>Join Jitsi Meet video call</w:t>
             </w:r>
           </w:p>
         </w:tc>
@@ -28833,13 +28422,8 @@
               <w:spacing w:line="360" w:lineRule="auto"/>
               <w:jc w:val="left"/>
             </w:pPr>
-            <w:proofErr w:type="spellStart"/>
-            <w:r>
-              <w:t>Jitsi</w:t>
-            </w:r>
-            <w:proofErr w:type="spellEnd"/>
-            <w:r>
-              <w:t xml:space="preserve"> Meet room loads in the video frame for both sides</w:t>
+            <w:r>
+              <w:t>Jitsi Meet room loads in the video frame for both sides</w:t>
             </w:r>
           </w:p>
         </w:tc>
@@ -29429,15 +29013,7 @@
               <w:jc w:val="left"/>
             </w:pPr>
             <w:r>
-              <w:t xml:space="preserve">Patient logs the medicine </w:t>
-            </w:r>
-            <w:proofErr w:type="spellStart"/>
-            <w:r>
-              <w:t>as</w:t>
-            </w:r>
-            <w:proofErr w:type="spellEnd"/>
-            <w:r>
-              <w:t xml:space="preserve"> taken if they login with caretaker</w:t>
+              <w:t>Patient logs the medicine as taken if they login with caretaker</w:t>
             </w:r>
           </w:p>
         </w:tc>
@@ -29610,13 +29186,8 @@
       <w:bookmarkEnd w:id="147"/>
     </w:p>
     <w:p>
-      <w:proofErr w:type="spellStart"/>
-      <w:r>
-        <w:t>MedTracker</w:t>
-      </w:r>
-      <w:proofErr w:type="spellEnd"/>
-      <w:r>
-        <w:t xml:space="preserve"> is a web-based medication management system that successfully achieves its primary objectives, such as secure login, manual prescription entry, dosage and quantity management by health workers (doctors or pharmacists), scheduling reminder times by patients or caregivers after prescriptions are provided, adherence tracking and report generation, and video consultation and text messaging between patients/caregivers and health workers. It also includes verification of medicine intake by the guardian, while reminders are sent to patients and caregivers through SMS or email. The system is monitored by the administrator and is developed using the Waterfall model as an SDLC approach. During testing and debugging, a couple of features were identified as failed, but they were later fixed, and </w:t>
+      <w:r>
+        <w:t xml:space="preserve">MedTracker is a web-based medication management system that successfully achieves its primary objectives, such as secure login, manual prescription entry, dosage and quantity management by health workers (doctors or pharmacists), scheduling reminder times by patients or caregivers after prescriptions are provided, adherence tracking and report generation, and video consultation and text messaging between patients/caregivers and health workers. It also includes verification of medicine intake by the guardian, while reminders are sent to patients and caregivers through SMS or email. The system is monitored by the administrator and is developed using the Waterfall model as an SDLC approach. During testing and debugging, a couple of features were identified as failed, but they were later fixed, and </w:t>
       </w:r>
       <w:r>
         <w:t>overall,</w:t>
@@ -29627,15 +29198,7 @@
     </w:p>
     <w:p>
       <w:r>
-        <w:t xml:space="preserve">Although it achieves its primary objectives, there are some limitations, such as a lack of multi-language support, no integration with individual hospitals or pharmacies, and the absence of advanced AI-based medication recommendation features. Additionally, the SMS reminder functionality depends on </w:t>
-      </w:r>
-      <w:proofErr w:type="spellStart"/>
-      <w:r>
-        <w:t>TextBee</w:t>
-      </w:r>
-      <w:proofErr w:type="spellEnd"/>
-      <w:r>
-        <w:t xml:space="preserve"> API credit limitations, which can be improved as a future enhancement. Other future improvements may include AI-based chatbots and payment integration for appointments with health workers. During development, we also faced several challenges, such as integrating the video conferencing API, finding an SMS API with sufficient free credits, and frequent XAMPP port crashes, which sometimes caused database loss. Overall, we enjoyed working on this project and gained practical knowledge of implementing core web technologies. Beyond classroom learning, the project provided us with an opportunity to explore and work with various APIs and libraries used during development.</w:t>
+        <w:t>Although it achieves its primary objectives, there are some limitations, such as a lack of multi-language support, no integration with individual hospitals or pharmacies, and the absence of advanced AI-based medication recommendation features. Additionally, the SMS reminder functionality depends on TextBee API credit limitations, which can be improved as a future enhancement. Other future improvements may include AI-based chatbots and payment integration for appointments with health workers. During development, we also faced several challenges, such as integrating the video conferencing API, finding an SMS API with sufficient free credits, and frequent XAMPP port crashes, which sometimes caused database loss. Overall, we enjoyed working on this project and gained practical knowledge of implementing core web technologies. Beyond classroom learning, the project provided us with an opportunity to explore and work with various APIs and libraries used during development.</w:t>
       </w:r>
     </w:p>
     <w:p/>
@@ -29665,15 +29228,7 @@
         <w:t xml:space="preserve"> </w:t>
       </w:r>
       <w:r>
-        <w:t xml:space="preserve">Aniket, D., Tanmay, G., Vaishnavi, G., Rutuja, G., &amp; </w:t>
-      </w:r>
-      <w:proofErr w:type="spellStart"/>
-      <w:r>
-        <w:t>Narode</w:t>
-      </w:r>
-      <w:proofErr w:type="spellEnd"/>
-      <w:r>
-        <w:t xml:space="preserve">, P. (2025). Smart complaint management system with AI-powered prioritization and escalation. </w:t>
+        <w:t xml:space="preserve">Aniket, D., Tanmay, G., Vaishnavi, G., Rutuja, G., &amp; Narode, P. (2025). Smart complaint management system with AI-powered prioritization and escalation. </w:t>
       </w:r>
       <w:r>
         <w:rPr>
@@ -29726,15 +29281,7 @@
         <w:jc w:val="left"/>
       </w:pPr>
       <w:r>
-        <w:t xml:space="preserve">Javed, R., </w:t>
-      </w:r>
-      <w:proofErr w:type="spellStart"/>
-      <w:r>
-        <w:t>Wasi</w:t>
-      </w:r>
-      <w:proofErr w:type="spellEnd"/>
-      <w:r>
-        <w:t xml:space="preserve">, S., Mughal, M. H., &amp; Bhutto, Z. A. (2025). Machine learning-based smart students' complaint resolution system. </w:t>
+        <w:t xml:space="preserve">Javed, R., Wasi, S., Mughal, M. H., &amp; Bhutto, Z. A. (2025). Machine learning-based smart students' complaint resolution system. </w:t>
       </w:r>
       <w:r>
         <w:rPr>
@@ -29781,15 +29328,7 @@
         <w:jc w:val="left"/>
       </w:pPr>
       <w:r>
-        <w:t xml:space="preserve">Prakash, J., </w:t>
-      </w:r>
-      <w:proofErr w:type="spellStart"/>
-      <w:r>
-        <w:t>Swathiramya</w:t>
-      </w:r>
-      <w:proofErr w:type="spellEnd"/>
-      <w:r>
-        <w:t xml:space="preserve">, R., Balambigai, G., Menaha, R., &amp; Abhirami, J. S. (2024). AI-driven real-time feedback system for enhanced student support: Leveraging sentiment analysis and machine learning algorithms. </w:t>
+        <w:t xml:space="preserve">Prakash, J., Swathiramya, R., Balambigai, G., Menaha, R., &amp; Abhirami, J. S. (2024). AI-driven real-time feedback system for enhanced student support: Leveraging sentiment analysis and machine learning algorithms. </w:t>
       </w:r>
       <w:r>
         <w:rPr>
@@ -37963,15 +37502,6 @@
 </file>
 
 <file path=customXml/item1.xml><?xml version="1.0" encoding="utf-8"?>
-<?mso-contentType ?>
-<FormTemplates xmlns="http://schemas.microsoft.com/sharepoint/v3/contenttype/forms">
-  <Display>DocumentLibraryForm</Display>
-  <Edit>DocumentLibraryForm</Edit>
-  <New>DocumentLibraryForm</New>
-</FormTemplates>
-</file>
-
-<file path=customXml/item2.xml><?xml version="1.0" encoding="utf-8"?>
 <ct:contentTypeSchema xmlns:ct="http://schemas.microsoft.com/office/2006/metadata/contentType" xmlns:ma="http://schemas.microsoft.com/office/2006/metadata/properties/metaAttributes" ct:_="" ma:_="" ma:contentTypeName="Document" ma:contentTypeID="0x01010064A8D4EBC99CE4479C5759E826728139" ma:contentTypeVersion="6" ma:contentTypeDescription="Create a new document." ma:contentTypeScope="" ma:versionID="07e2aa3ff3142c046ecc4ad8a2c1def4">
   <xsd:schema xmlns:xsd="http://www.w3.org/2001/XMLSchema" xmlns:xs="http://www.w3.org/2001/XMLSchema" xmlns:p="http://schemas.microsoft.com/office/2006/metadata/properties" xmlns:ns3="cc2b98dd-a3ce-4b84-abaf-6c0c1556bdc1" targetNamespace="http://schemas.microsoft.com/office/2006/metadata/properties" ma:root="true" ma:fieldsID="38beac91e278606adb72b4d78cee20ef" ns3:_="">
     <xsd:import namespace="cc2b98dd-a3ce-4b84-abaf-6c0c1556bdc1"/>
@@ -38127,7 +37657,24 @@
 </ct:contentTypeSchema>
 </file>
 
+<file path=customXml/item2.xml><?xml version="1.0" encoding="utf-8"?>
+<?mso-contentType ?>
+<FormTemplates xmlns="http://schemas.microsoft.com/sharepoint/v3/contenttype/forms">
+  <Display>DocumentLibraryForm</Display>
+  <Edit>DocumentLibraryForm</Edit>
+  <New>DocumentLibraryForm</New>
+</FormTemplates>
+</file>
+
 <file path=customXml/item3.xml><?xml version="1.0" encoding="utf-8"?>
+<p:properties xmlns:p="http://schemas.microsoft.com/office/2006/metadata/properties" xmlns:xsi="http://www.w3.org/2001/XMLSchema-instance" xmlns:pc="http://schemas.microsoft.com/office/infopath/2007/PartnerControls">
+  <documentManagement>
+    <_activity xmlns="cc2b98dd-a3ce-4b84-abaf-6c0c1556bdc1" xsi:nil="true"/>
+  </documentManagement>
+</p:properties>
+</file>
+
+<file path=customXml/item4.xml><?xml version="1.0" encoding="utf-8"?>
 <b:Sources xmlns:b="http://schemas.openxmlformats.org/officeDocument/2006/bibliography" xmlns="http://schemas.openxmlformats.org/officeDocument/2006/bibliography" SelectedStyle="\IEEE2006OfficeOnline.xsl" StyleName="IEEE" Version="2006">
   <b:Source>
     <b:Tag>DEO</b:Tag>
@@ -38150,23 +37697,7 @@
 </b:Sources>
 </file>
 
-<file path=customXml/item4.xml><?xml version="1.0" encoding="utf-8"?>
-<p:properties xmlns:p="http://schemas.microsoft.com/office/2006/metadata/properties" xmlns:xsi="http://www.w3.org/2001/XMLSchema-instance" xmlns:pc="http://schemas.microsoft.com/office/infopath/2007/PartnerControls">
-  <documentManagement>
-    <_activity xmlns="cc2b98dd-a3ce-4b84-abaf-6c0c1556bdc1" xsi:nil="true"/>
-  </documentManagement>
-</p:properties>
-</file>
-
 <file path=customXml/itemProps1.xml><?xml version="1.0" encoding="utf-8"?>
-<ds:datastoreItem xmlns:ds="http://schemas.openxmlformats.org/officeDocument/2006/customXml" ds:itemID="{5D589DD0-D354-4F48-B124-BC4B13209AF5}">
-  <ds:schemaRefs>
-    <ds:schemaRef ds:uri="http://schemas.microsoft.com/sharepoint/v3/contenttype/forms"/>
-  </ds:schemaRefs>
-</ds:datastoreItem>
-</file>
-
-<file path=customXml/itemProps2.xml><?xml version="1.0" encoding="utf-8"?>
 <ds:datastoreItem xmlns:ds="http://schemas.openxmlformats.org/officeDocument/2006/customXml" ds:itemID="{A3A14B7D-E2B3-46A9-82DC-59DCA21D7AB9}">
   <ds:schemaRefs>
     <ds:schemaRef ds:uri="http://schemas.microsoft.com/office/2006/metadata/contentType"/>
@@ -38184,15 +37715,15 @@
 </ds:datastoreItem>
 </file>
 
-<file path=customXml/itemProps3.xml><?xml version="1.0" encoding="utf-8"?>
-<ds:datastoreItem xmlns:ds="http://schemas.openxmlformats.org/officeDocument/2006/customXml" ds:itemID="{C077D7FC-7871-44B2-9B84-9266ADD89A4C}">
+<file path=customXml/itemProps2.xml><?xml version="1.0" encoding="utf-8"?>
+<ds:datastoreItem xmlns:ds="http://schemas.openxmlformats.org/officeDocument/2006/customXml" ds:itemID="{5D589DD0-D354-4F48-B124-BC4B13209AF5}">
   <ds:schemaRefs>
-    <ds:schemaRef ds:uri="http://schemas.openxmlformats.org/officeDocument/2006/bibliography"/>
+    <ds:schemaRef ds:uri="http://schemas.microsoft.com/sharepoint/v3/contenttype/forms"/>
   </ds:schemaRefs>
 </ds:datastoreItem>
 </file>
 
-<file path=customXml/itemProps4.xml><?xml version="1.0" encoding="utf-8"?>
+<file path=customXml/itemProps3.xml><?xml version="1.0" encoding="utf-8"?>
 <ds:datastoreItem xmlns:ds="http://schemas.openxmlformats.org/officeDocument/2006/customXml" ds:itemID="{2B366DCC-66CC-4825-B708-3DFF84A14A39}">
   <ds:schemaRefs>
     <ds:schemaRef ds:uri="http://schemas.microsoft.com/office/2006/metadata/properties"/>
@@ -38200,4 +37731,12 @@
     <ds:schemaRef ds:uri="cc2b98dd-a3ce-4b84-abaf-6c0c1556bdc1"/>
   </ds:schemaRefs>
 </ds:datastoreItem>
+</file>
+
+<file path=customXml/itemProps4.xml><?xml version="1.0" encoding="utf-8"?>
+<ds:datastoreItem xmlns:ds="http://schemas.openxmlformats.org/officeDocument/2006/customXml" ds:itemID="{C077D7FC-7871-44B2-9B84-9266ADD89A4C}">
+  <ds:schemaRefs>
+    <ds:schemaRef ds:uri="http://schemas.openxmlformats.org/officeDocument/2006/bibliography"/>
+  </ds:schemaRefs>
+</ds:datastoreItem>
 </file>
</xml_diff>